<commit_message>
Rebrand from Cadre & Consilium Group to Restoricon
Replace logo, update business name/email across site and MSA contract,
and refresh QWEN.md to match the renamed repo and directory.

Co-Authored-By: Claude Sonnet 5 <noreply@anthropic.com>
</commit_message>
<xml_diff>
--- a/assets/documents/Subcontractor_MSA.docx
+++ b/assets/documents/Subcontractor_MSA.docx
@@ -63,7 +63,7 @@
           <ns0:sz ns0:val="22"/>
           <ns0:szCs ns0:val="22"/>
         </ns0:rPr>
-        <ns0:t xml:space="preserve">Cadre &amp; Consilium Group, LLC</ns0:t>
+        <ns0:t xml:space="preserve">Restoricon, LLC</ns0:t>
       </ns0:r>
     </ns0:p>
     <ns0:p>
@@ -77,7 +77,7 @@
           <ns0:sz ns0:val="21"/>
           <ns0:szCs ns0:val="21"/>
         </ns0:rPr>
-        <ns0:t xml:space="preserve">Phone: (860) 266-9332  |  Email: cadre.projectmanager@gmail.com</ns0:t>
+        <ns0:t xml:space="preserve">Phone: (860) 266-9332  |  Email: restoricon@gmail.com</ns0:t>
       </ns0:r>
     </ns0:p>
     <ns0:p>
@@ -223,7 +223,7 @@
           <ns0:sz ns0:val="21"/>
           <ns0:szCs ns0:val="21"/>
         </ns0:rPr>
-        <ns0:t xml:space="preserve">This Subcontractor Master Services Agreement ("Agreement") is made and entered into effective as of ___________________, 20____ (the "Effective Date"), by and between Cadre &amp; Consilium Group, LLC, a Connecticut limited liability company and a division of Cadre &amp; Consilium Group, Inc. ("Contractor"), with its principal place of business at 1680 Berlin Turnpike, Wethersfield, Connecticut 06109, and [Subcontractor Business Name, LLC/Inc.], with its principal place of business at [Subcontractor Street Address] ("Subcontractor"). Contractor and Subcontractor are each individually referred to herein as a "Party" and collectively as the "Parties."</ns0:t>
+        <ns0:t xml:space="preserve">This Subcontractor Master Services Agreement ("Agreement") is made and entered into effective as of ___________________, 20____ (the "Effective Date"), by and between Restoricon, LLC, a Connecticut limited liability company and a division of Restoricon, Inc. ("Contractor"), with its principal place of business at 1680 Berlin Turnpike, Wethersfield, Connecticut 06109, and [Subcontractor Business Name, LLC/Inc.], with its principal place of business at [Subcontractor Street Address] ("Subcontractor"). Contractor and Subcontractor are each individually referred to herein as a "Party" and collectively as the "Parties."</ns0:t>
       </ns0:r>
     </ns0:p>
     <ns0:p>
@@ -472,7 +472,7 @@
           <ns0:sz ns0:val="21"/>
           <ns0:szCs ns0:val="21"/>
         </ns0:rPr>
-        <ns0:t xml:space="preserve">means Cadre &amp; Consilium Group, LLC, its successors and permitted assigns.</ns0:t>
+        <ns0:t xml:space="preserve">means Restoricon, LLC, its successors and permitted assigns.</ns0:t>
       </ns0:r>
     </ns0:p>
     <ns0:p>
@@ -616,7 +616,7 @@
           <ns0:sz ns0:val="21"/>
           <ns0:szCs ns0:val="21"/>
         </ns0:rPr>
-        <ns0:t xml:space="preserve">means Cadre &amp; Consilium Group, Inc., the parent company of Contractor.</ns0:t>
+        <ns0:t xml:space="preserve">means Restoricon, Inc., the parent company of Contractor.</ns0:t>
       </ns0:r>
     </ns0:p>
     <ns0:p>
@@ -1808,7 +1808,7 @@
           <ns0:sz ns0:val="21"/>
           <ns0:szCs ns0:val="21"/>
         </ns0:rPr>
-        <ns0:t xml:space="preserve">Subcontractor's Commercial General Liability and Automobile Liability policies shall be endorsed to name Cadre &amp; Consilium Group, LLC and Cadre &amp; Consilium Group, Inc., together with such other parties as Contractor may reasonably designate (including any Owner, as required by the applicable prime contract), as additional insureds, on a primary and non-contributory basis, using an endorsement form providing coverage at least as broad as ISO CG 20 10 and CG 20 37 (or their equivalents).</ns0:t>
+        <ns0:t xml:space="preserve">Subcontractor's Commercial General Liability and Automobile Liability policies shall be endorsed to name Restoricon, LLC and Restoricon, Inc., together with such other parties as Contractor may reasonably designate (including any Owner, as required by the applicable prime contract), as additional insureds, on a primary and non-contributory basis, using an endorsement form providing coverage at least as broad as ISO CG 20 10 and CG 20 37 (or their equivalents).</ns0:t>
       </ns0:r>
     </ns0:p>
     <ns0:p>
@@ -5452,7 +5452,7 @@
           <ns0:sz ns0:val="21"/>
           <ns0:szCs ns0:val="21"/>
         </ns0:rPr>
-        <ns0:t xml:space="preserve">Cadre &amp; Consilium Group, LLC</ns0:t>
+        <ns0:t xml:space="preserve">Restoricon, LLC</ns0:t>
       </ns0:r>
     </ns0:p>
     <ns0:p>
@@ -5465,7 +5465,7 @@
           <ns0:sz ns0:val="21"/>
           <ns0:szCs ns0:val="21"/>
         </ns0:rPr>
-        <ns0:t xml:space="preserve">By its Parent Corporation, Cadre &amp; Consilium Group, Inc.</ns0:t>
+        <ns0:t xml:space="preserve">By its Parent Corporation, Restoricon, Inc.</ns0:t>
       </ns0:r>
     </ns0:p>
     <ns0:p>
@@ -5879,7 +5879,7 @@
           <ns0:sz ns0:val="21"/>
           <ns0:szCs ns0:val="21"/>
         </ns0:rPr>
-        <ns0:t xml:space="preserve">The Commercial General Liability and Commercial Automobile Liability policies shall be endorsed to name Cadre &amp; Consilium Group, LLC and Cadre &amp; Consilium Group, Inc. as additional insureds on a primary and non-contributory basis, using endorsement forms at least as broad as ISO CG 20 10 (ongoing operations) and ISO CG 20 37 (completed operations), or their equivalents.</ns0:t>
+        <ns0:t xml:space="preserve">The Commercial General Liability and Commercial Automobile Liability policies shall be endorsed to name Restoricon, LLC and Restoricon, Inc. as additional insureds on a primary and non-contributory basis, using endorsement forms at least as broad as ISO CG 20 10 (ongoing operations) and ISO CG 20 37 (completed operations), or their equivalents.</ns0:t>
       </ns0:r>
     </ns0:p>
     <ns0:p>
@@ -5984,7 +5984,7 @@
           <ns0:sz ns0:val="21"/>
           <ns0:szCs ns0:val="21"/>
         </ns0:rPr>
-        <ns0:t xml:space="preserve">Subcontractor shall furnish a Certificate of Insurance (ACORD 25 or equivalent) evidencing all required coverages prior to the commencement of Work, listing Cadre &amp; Consilium Group, LLC and Cadre &amp; Consilium Group, Inc. as certificate holders and additional insureds, and shall furnish updated certificates upon renewal or at Contractor's request.</ns0:t>
+        <ns0:t xml:space="preserve">Subcontractor shall furnish a Certificate of Insurance (ACORD 25 or equivalent) evidencing all required coverages prior to the commencement of Work, listing Restoricon, LLC and Restoricon, Inc. as certificate holders and additional insureds, and shall furnish updated certificates upon renewal or at Contractor's request.</ns0:t>
       </ns0:r>
     </ns0:p>
     <ns0:p>
@@ -6054,7 +6054,7 @@
           <ns0:sz ns0:val="21"/>
           <ns0:szCs ns0:val="21"/>
         </ns0:rPr>
-        <ns0:t xml:space="preserve">This Work Order is issued pursuant to, and incorporates by reference, the Subcontractor Master Services Agreement dated ___________________, 20____ (the "Agreement") between Cadre &amp; Consilium Group, LLC ("Contractor") and the Subcontractor identified below. In the event of any conflict, the Agreement shall govern except as to the project-specific terms set forth below. Where applicable, this Work Order shall be read together with the applicable Trade-Specific Work Order Attachment(s) in Exhibit B-2.</ns0:t>
+        <ns0:t xml:space="preserve">This Work Order is issued pursuant to, and incorporates by reference, the Subcontractor Master Services Agreement dated ___________________, 20____ (the "Agreement") between Restoricon, LLC ("Contractor") and the Subcontractor identified below. In the event of any conflict, the Agreement shall govern except as to the project-specific terms set forth below. Where applicable, this Work Order shall be read together with the applicable Trade-Specific Work Order Attachment(s) in Exhibit B-2.</ns0:t>
       </ns0:r>
     </ns0:p>
     <ns0:tbl>
@@ -10538,7 +10538,7 @@
           <ns0:sz ns0:val="21"/>
           <ns0:szCs ns0:val="21"/>
         </ns0:rPr>
-        <ns0:t xml:space="preserve">CONTRACTOR: Cadre &amp; Consilium Group, LLC — By: J. Alvarez (signature on file)   Date: 03/10/2026</ns0:t>
+        <ns0:t xml:space="preserve">CONTRACTOR: Restoricon, LLC — By: J. Alvarez (signature on file)   Date: 03/10/2026</ns0:t>
       </ns0:r>
     </ns0:p>
     <ns0:p>
@@ -15316,7 +15316,7 @@
           <ns0:sz ns0:val="21"/>
           <ns0:szCs ns0:val="21"/>
         </ns0:rPr>
-        <ns0:t xml:space="preserve">CONTRACTOR: Cadre &amp; Consilium Group, LLC</ns0:t>
+        <ns0:t xml:space="preserve">CONTRACTOR: Restoricon, LLC</ns0:t>
       </ns0:r>
     </ns0:p>
     <ns0:p>
@@ -17071,7 +17071,7 @@
           <ns0:sz ns0:val="21"/>
           <ns0:szCs ns0:val="21"/>
         </ns0:rPr>
-        <ns0:t xml:space="preserve">CONTRACTOR: Cadre &amp; Consilium Group, LLC — By: J. Alvarez (signature on file)   Date: 03/19/2026</ns0:t>
+        <ns0:t xml:space="preserve">CONTRACTOR: Restoricon, LLC — By: J. Alvarez (signature on file)   Date: 03/19/2026</ns0:t>
       </ns0:r>
     </ns0:p>
     <ns0:p>
@@ -18052,7 +18052,7 @@
           <ns0:sz ns0:val="21"/>
           <ns0:szCs ns0:val="21"/>
         </ns0:rPr>
-        <ns0:t xml:space="preserve">Upon receipt by the undersigned of a check in the amount of $__________ payable to [Subcontractor Name] and when the check has been properly endorsed and has cleared normal banking channels, this document becomes effective to release any mechanic's lien, stop notice, or bond right the undersigned has on the job of Cadre &amp; Consilium Group, LLC located at [Project Address] (the "Project") to the following extent: This release covers a progress payment for labor, services, equipment, or material furnished to [Subcontractor Name] through ___________________, 20____ only, and does not cover any retention withheld, any items furnished after that date, or any items not yet paid for.</ns0:t>
+        <ns0:t xml:space="preserve">Upon receipt by the undersigned of a check in the amount of $__________ payable to [Subcontractor Name] and when the check has been properly endorsed and has cleared normal banking channels, this document becomes effective to release any mechanic's lien, stop notice, or bond right the undersigned has on the job of Restoricon, LLC located at [Project Address] (the "Project") to the following extent: This release covers a progress payment for labor, services, equipment, or material furnished to [Subcontractor Name] through ___________________, 20____ only, and does not cover any retention withheld, any items furnished after that date, or any items not yet paid for.</ns0:t>
       </ns0:r>
     </ns0:p>
     <ns0:p>
@@ -18283,7 +18283,7 @@
           <ns0:sz ns0:val="21"/>
           <ns0:szCs ns0:val="21"/>
         </ns0:rPr>
-        <ns0:t xml:space="preserve">The undersigned has been paid in full for all labor, services, equipment, and material furnished to Cadre &amp; Consilium Group, LLC in connection with the Project located at [Project Address], and does hereby unconditionally waive and release any and all mechanic's lien, stop notice, or bond rights the undersigned has on the Project through ___________________, 20____, including, without limitation, all rights to file or record a certificate of mechanic's lien under Conn. Gen. Stat. § 49-33 et seq. arising from Work performed or materials furnished by the undersigned in connection with the Project.</ns0:t>
+        <ns0:t xml:space="preserve">The undersigned has been paid in full for all labor, services, equipment, and material furnished to Restoricon, LLC in connection with the Project located at [Project Address], and does hereby unconditionally waive and release any and all mechanic's lien, stop notice, or bond rights the undersigned has on the Project through ___________________, 20____, including, without limitation, all rights to file or record a certificate of mechanic's lien under Conn. Gen. Stat. § 49-33 et seq. arising from Work performed or materials furnished by the undersigned in connection with the Project.</ns0:t>
       </ns0:r>
     </ns0:p>
     <ns0:p>
@@ -18595,7 +18595,7 @@
       <ns1:inline distT="0" distB="0" distL="0" distR="0">
         <ns1:extent cx="1800000" cy="1800000"/>
         <ns1:effectExtent l="0" t="0" r="0" b="0"/>
-        <ns1:docPr id="1" name="Logo" descr="Cadre &amp; Consilium Group Logo"/>
+        <ns1:docPr id="1" name="Logo" descr="Restoricon Logo"/>
         <ns1:cNvGraphicFramePr>
           <ns1:graphicFrameLocks noChangeAspect="true"/>
         </ns1:cNvGraphicFramePr>
@@ -18603,7 +18603,7 @@
           <ns1:graphicData uri="http://schemas.openxmlformats.org/drawingml/2006/picture">
             <ns2:pic>
               <ns2:nvPicPr>
-                <ns2:cNvPr id="0" name="Logo" descr="Cadre &amp; Consilium Group Logo"/>
+                <ns2:cNvPr id="0" name="Logo" descr="Restoricon Logo"/>
                 <ns2:cNvPicPr>
                   <ns2:picLocks noChangeAspect="true" noChangeArrowheads="true"/>
                 </ns2:cNvPicPr>
@@ -18640,7 +18640,7 @@
         <ns1:inline distT="0" distB="0" distL="0" distR="0">
           <ns1:extent cx="1371600" cy="457200"/>
           <ns1:effectExtent l="0" t="0" r="0" b="0"/>
-          <ns1:docPr id="1" name="Cadre &amp; Consilium Group Logo" descr="Cadre &amp; Consilium Group, LLC Logo"/>
+          <ns1:docPr id="1" name="Restoricon Logo" descr="Restoricon, LLC Logo"/>
           <ns1:cNvGraphicFramePr>
             <ns4:graphicFrameLocks noChangeAspect="1"/>
           </ns1:cNvGraphicFramePr>
@@ -18681,7 +18681,7 @@
         <ns0:sz ns0:val="16"/>
         <ns0:szCs ns0:val="16"/>
       </ns0:rPr>
-      <ns0:t xml:space="preserve">Subcontractor Master Services Agreement — Cadre &amp; Consilium Group, LLC</ns0:t>
+      <ns0:t xml:space="preserve">Subcontractor Master Services Agreement — Restoricon, LLC</ns0:t>
     </ns0:r>
   </ns0:p>
 </ns0:hdr>

</xml_diff>